<commit_message>
specifikáció + menü kezdet (csak test)
</commit_message>
<xml_diff>
--- a/asztali-projekt-2026/projektterv.docx
+++ b/asztali-projekt-2026/projektterv.docx
@@ -3,26 +3,101 @@
 <w:document xmlns:wpc="http://schemas.microsoft.com/office/word/2010/wordprocessingCanvas" xmlns:cx="http://schemas.microsoft.com/office/drawing/2014/chartex" xmlns:cx1="http://schemas.microsoft.com/office/drawing/2015/9/8/chartex" xmlns:cx2="http://schemas.microsoft.com/office/drawing/2015/10/21/chartex" xmlns:cx3="http://schemas.microsoft.com/office/drawing/2016/5/9/chartex" xmlns:cx4="http://schemas.microsoft.com/office/drawing/2016/5/10/chartex" xmlns:cx5="http://schemas.microsoft.com/office/drawing/2016/5/11/chartex" xmlns:cx6="http://schemas.microsoft.com/office/drawing/2016/5/12/chartex" xmlns:cx7="http://schemas.microsoft.com/office/drawing/2016/5/13/chartex" xmlns:cx8="http://schemas.microsoft.com/office/drawing/2016/5/14/chartex" xmlns:mc="http://schemas.openxmlformats.org/markup-compatibility/2006" xmlns:aink="http://schemas.microsoft.com/office/drawing/2016/ink" xmlns:am3d="http://schemas.microsoft.com/office/drawing/2017/model3d" xmlns:o="urn:schemas-microsoft-com:office:office" xmlns:r="http://schemas.openxmlformats.org/officeDocument/2006/relationships" xmlns:m="http://schemas.openxmlformats.org/officeDocument/2006/math" xmlns:v="urn:schemas-microsoft-com:vml" xmlns:wp14="http://schemas.microsoft.com/office/word/2010/wordprocessingDrawing" xmlns:wp="http://schemas.openxmlformats.org/drawingml/2006/wordprocessingDrawing" xmlns:w10="urn:schemas-microsoft-com:office:word" xmlns:w="http://schemas.openxmlformats.org/wordprocessingml/2006/main" xmlns:w14="http://schemas.microsoft.com/office/word/2010/wordml" xmlns:w15="http://schemas.microsoft.com/office/word/2012/wordml" xmlns:w16cid="http://schemas.microsoft.com/office/word/2016/wordml/cid" xmlns:w16se="http://schemas.microsoft.com/office/word/2015/wordml/symex" xmlns:wpg="http://schemas.microsoft.com/office/word/2010/wordprocessingGroup" xmlns:wpi="http://schemas.microsoft.com/office/word/2010/wordprocessingInk" xmlns:wne="http://schemas.microsoft.com/office/word/2006/wordml" xmlns:wps="http://schemas.microsoft.com/office/word/2010/wordprocessingShape" mc:Ignorable="w14 w15 w16se w16cid wp14">
   <w:body>
     <w:p>
-      <w:r>
-        <w:t>metódusok:</w:t>
-      </w:r>
-    </w:p>
-    <w:p>
-      <w:r>
-        <w:t>összes játékos kilistázása</w:t>
-      </w:r>
-    </w:p>
-    <w:p>
-      <w:r>
-        <w:t>játékos specifikus szűrés</w:t>
-      </w:r>
-    </w:p>
-    <w:p>
-      <w:r>
-        <w:t>kinek van több mint megadott gólmennyiség</w:t>
+      <w:pPr>
+        <w:jc w:val="center"/>
+      </w:pPr>
+      <w:r>
+        <w:t>Projekt specifikáció</w:t>
+      </w:r>
+    </w:p>
+    <w:p>
+      <w:pPr>
+        <w:jc w:val="center"/>
+      </w:pPr>
+    </w:p>
+    <w:p>
+      <w:r>
+        <w:t>Készítők:</w:t>
+      </w:r>
+    </w:p>
+    <w:p>
+      <w:r>
+        <w:t>Lakatos Botond</w:t>
+      </w:r>
+    </w:p>
+    <w:p>
+      <w:r>
+        <w:t>Urbán Dávid</w:t>
+      </w:r>
+    </w:p>
+    <w:p/>
+    <w:p>
+      <w:r>
+        <w:t>Alap ötlet:</w:t>
+      </w:r>
+    </w:p>
+    <w:p>
+      <w:r>
+        <w:t xml:space="preserve">Az alkalmazás focisták adatainak lekérdezésére alkalmas. SQL adatbázis tárolja az adatokat és az alkalmazás elindításakor a program lekérdezi az adatokat az adatbázisból. Egy C# </w:t>
+      </w:r>
+      <w:proofErr w:type="spellStart"/>
+      <w:r>
+        <w:t>classba</w:t>
+      </w:r>
+      <w:proofErr w:type="spellEnd"/>
+      <w:r>
+        <w:t xml:space="preserve"> feltöltjük az adatokat és abból készítünk lekérdezéseket.</w:t>
+      </w:r>
+    </w:p>
+    <w:p>
+      <w:r>
+        <w:t xml:space="preserve"> Lekérdezések:</w:t>
+      </w:r>
+    </w:p>
+    <w:p>
+      <w:r>
+        <w:t>Minden játékos minden adatának lekérdezése.</w:t>
+      </w:r>
+    </w:p>
+    <w:p>
+      <w:r>
+        <w:t xml:space="preserve">Egy játékos minden adatának kilistázása. </w:t>
+      </w:r>
+    </w:p>
+    <w:p>
+      <w:r>
+        <w:t>Felhasználó által megadott gólmennyisége túllépő játékosok kilistázása.</w:t>
+      </w:r>
+    </w:p>
+    <w:p>
+      <w:r>
+        <w:t>A felhasználó megad egy százalékot</w:t>
       </w:r>
       <w:bookmarkStart w:id="0" w:name="_GoBack"/>
       <w:bookmarkEnd w:id="0"/>
+    </w:p>
+    <w:p/>
+    <w:p/>
+    <w:p/>
+    <w:p>
+      <w:r>
+        <w:t>metódusok:</w:t>
+      </w:r>
+    </w:p>
+    <w:p>
+      <w:r>
+        <w:t>összes játékos kilistázása</w:t>
+      </w:r>
+    </w:p>
+    <w:p>
+      <w:r>
+        <w:t>játékos specifikus szűrés</w:t>
+      </w:r>
+    </w:p>
+    <w:p>
+      <w:r>
+        <w:t>kinek van több mint megadott gólmennyiség</w:t>
+      </w:r>
     </w:p>
     <w:p>
       <w:r>

</xml_diff>